<commit_message>
correcting flow for project creation
</commit_message>
<xml_diff>
--- a/AI_BOT_TEST/test_trascription/docs/transcript.docx
+++ b/AI_BOT_TEST/test_trascription/docs/transcript.docx
@@ -7,12 +7,12 @@
         <w:pStyle w:val="Title"/>
       </w:pPr>
       <w:r>
-        <w:t>Meeting - 2025-07-28 22:20</w:t>
+        <w:t>Meeting - 2025-07-29 19:57</w:t>
       </w:r>
     </w:p>
     <w:p>
       <w:r>
-        <w:t>Hello. I'm your Scrum Master. Let's begin with our daily stand up.</w:t>
+        <w:t>Hello. It's Anika.</w:t>
       </w:r>
     </w:p>
     <w:sectPr>

</xml_diff>